<commit_message>
modificaciones front-end y actualizacion documento definicion proyecto en inglés
</commit_message>
<xml_diff>
--- a/Fase 1/Evidencias Grupales/1.5_GuiaEstudiante_Fase 1_Definicion Proyecto APT (Inglés).docx
+++ b/Fase 1/Evidencias Grupales/1.5_GuiaEstudiante_Fase 1_Definicion Proyecto APT (Inglés).docx
@@ -24,7 +24,7 @@
                 <wp:positionV relativeFrom="paragraph">
                   <wp:posOffset>33444</wp:posOffset>
                 </wp:positionV>
-                <wp:extent cx="6580505" cy="1486535"/>
+                <wp:extent cx="6580505" cy="1500317"/>
                 <wp:effectExtent b="0" l="0" r="0" t="0"/>
                 <wp:wrapNone/>
                 <wp:docPr id="48" name=""/>
@@ -35,7 +35,7 @@
                       <wpg:grpSpPr>
                         <a:xfrm>
                           <a:off x="2055725" y="3036725"/>
-                          <a:ext cx="6580505" cy="1486535"/>
+                          <a:ext cx="6580505" cy="1500317"/>
                           <a:chOff x="2055725" y="3036725"/>
                           <a:chExt cx="6580550" cy="1486550"/>
                         </a:xfrm>
@@ -138,7 +138,46 @@
                                     <w:sz w:val="48"/>
                                     <w:vertAlign w:val="baseline"/>
                                   </w:rPr>
-                                  <w:t xml:space="preserve">Guía1. Definición Proyecto APT </w:t>
+                                  <w:t xml:space="preserve">Guide 1</w:t>
+                                </w:r>
+                                <w:r>
+                                  <w:rPr>
+                                    <w:rFonts w:ascii="Calibri" w:cs="Calibri" w:eastAsia="Calibri" w:hAnsi="Calibri"/>
+                                    <w:b w:val="1"/>
+                                    <w:i w:val="0"/>
+                                    <w:smallCaps w:val="0"/>
+                                    <w:strike w:val="0"/>
+                                    <w:color w:val="1f3864"/>
+                                    <w:sz w:val="48"/>
+                                    <w:vertAlign w:val="baseline"/>
+                                  </w:rPr>
+                                  <w:t xml:space="preserve">. </w:t>
+                                </w:r>
+                                <w:r>
+                                  <w:rPr>
+                                    <w:rFonts w:ascii="Calibri" w:cs="Calibri" w:eastAsia="Calibri" w:hAnsi="Calibri"/>
+                                    <w:b w:val="1"/>
+                                    <w:i w:val="0"/>
+                                    <w:smallCaps w:val="0"/>
+                                    <w:strike w:val="0"/>
+                                    <w:color w:val="1f3864"/>
+                                    <w:sz w:val="48"/>
+                                    <w:vertAlign w:val="baseline"/>
+                                  </w:rPr>
+                                  <w:t xml:space="preserve">Project Definition</w:t>
+                                </w:r>
+                                <w:r>
+                                  <w:rPr>
+                                    <w:rFonts w:ascii="Calibri" w:cs="Calibri" w:eastAsia="Calibri" w:hAnsi="Calibri"/>
+                                    <w:b w:val="1"/>
+                                    <w:i w:val="0"/>
+                                    <w:smallCaps w:val="0"/>
+                                    <w:strike w:val="0"/>
+                                    <w:color w:val="1f3864"/>
+                                    <w:sz w:val="48"/>
+                                    <w:vertAlign w:val="baseline"/>
+                                  </w:rPr>
+                                  <w:t xml:space="preserve"> APT </w:t>
                                 </w:r>
                               </w:p>
                               <w:p>
@@ -171,7 +210,20 @@
                                     <w:sz w:val="48"/>
                                     <w:vertAlign w:val="baseline"/>
                                   </w:rPr>
-                                  <w:t xml:space="preserve">Asignatura Capstone</w:t>
+                                  <w:t xml:space="preserve">Subject: </w:t>
+                                </w:r>
+                                <w:r>
+                                  <w:rPr>
+                                    <w:rFonts w:ascii="Calibri" w:cs="Calibri" w:eastAsia="Calibri" w:hAnsi="Calibri"/>
+                                    <w:b w:val="1"/>
+                                    <w:i w:val="0"/>
+                                    <w:smallCaps w:val="0"/>
+                                    <w:strike w:val="0"/>
+                                    <w:color w:val="1f3864"/>
+                                    <w:sz w:val="48"/>
+                                    <w:vertAlign w:val="baseline"/>
+                                  </w:rPr>
+                                  <w:t xml:space="preserve">Capstone</w:t>
                                 </w:r>
                               </w:p>
                             </w:txbxContent>
@@ -231,7 +283,7 @@
                 <wp:positionV relativeFrom="paragraph">
                   <wp:posOffset>33444</wp:posOffset>
                 </wp:positionV>
-                <wp:extent cx="6580505" cy="1486535"/>
+                <wp:extent cx="6580505" cy="1500317"/>
                 <wp:effectExtent b="0" l="0" r="0" t="0"/>
                 <wp:wrapNone/>
                 <wp:docPr id="48" name="image2.png"/>
@@ -243,7 +295,7 @@
                         <pic:cNvPicPr preferRelativeResize="0"/>
                       </pic:nvPicPr>
                       <pic:blipFill>
-                        <a:blip r:embed="rId8"/>
+                        <a:blip r:embed="rId7"/>
                         <a:srcRect/>
                         <a:stretch>
                           <a:fillRect/>
@@ -252,7 +304,7 @@
                       <pic:spPr>
                         <a:xfrm>
                           <a:off x="0" y="0"/>
-                          <a:ext cx="6580505" cy="1486535"/>
+                          <a:ext cx="6580505" cy="1500317"/>
                         </a:xfrm>
                         <a:prstGeom prst="rect"/>
                         <a:ln/>
@@ -367,6 +419,16 @@
       </w:pPr>
       <w:r>
         <w:rPr>
+          <w:b w:val="1"/>
+          <w:color w:val="4472c4"/>
+          <w:sz w:val="32"/>
+          <w:szCs w:val="32"/>
+          <w:rtl w:val="0"/>
+        </w:rPr>
+        <w:t xml:space="preserve">Part </w:t>
+      </w:r>
+      <w:r>
+        <w:rPr>
           <w:rFonts w:ascii="Calibri" w:cs="Calibri" w:eastAsia="Calibri" w:hAnsi="Calibri"/>
           <w:b w:val="1"/>
           <w:i w:val="0"/>
@@ -380,7 +442,7 @@
           <w:vertAlign w:val="baseline"/>
           <w:rtl w:val="0"/>
         </w:rPr>
-        <w:t xml:space="preserve">PARTE I</w:t>
+        <w:t xml:space="preserve">I</w:t>
       </w:r>
     </w:p>
     <w:tbl>
@@ -435,7 +497,7 @@
                 <w:szCs w:val="28"/>
                 <w:rtl w:val="0"/>
               </w:rPr>
-              <w:t xml:space="preserve">1. Antecedentes Personales</w:t>
+              <w:t xml:space="preserve">1. Personal Information</w:t>
             </w:r>
           </w:p>
         </w:tc>
@@ -488,6 +550,13 @@
             </w:pPr>
             <w:r>
               <w:rPr>
+                <w:color w:val="1f3864"/>
+                <w:rtl w:val="0"/>
+              </w:rPr>
+              <w:t xml:space="preserve">Below is a table in which you must complete the requested information.</w:t>
+            </w:r>
+            <w:r>
+              <w:rPr>
                 <w:rFonts w:ascii="Calibri" w:cs="Calibri" w:eastAsia="Calibri" w:hAnsi="Calibri"/>
                 <w:b w:val="0"/>
                 <w:i w:val="0"/>
@@ -501,7 +570,7 @@
                 <w:vertAlign w:val="baseline"/>
                 <w:rtl w:val="0"/>
               </w:rPr>
-              <w:t xml:space="preserve">A continuación, se presenta una tabla en la que debes completar la información solicitada. </w:t>
+              <w:t xml:space="preserve"> </w:t>
             </w:r>
           </w:p>
         </w:tc>
@@ -568,11 +637,15 @@
             </w:pPr>
             <w:r>
               <w:rPr>
-                <w:rFonts w:ascii="Calibri" w:cs="Calibri" w:eastAsia="Calibri" w:hAnsi="Calibri"/>
                 <w:color w:val="1f3864"/>
                 <w:rtl w:val="0"/>
               </w:rPr>
-              <w:t xml:space="preserve">Nombre estudiante</w:t>
+              <w:t xml:space="preserve">Names</w:t>
+            </w:r>
+            <w:r>
+              <w:rPr>
+                <w:rtl w:val="0"/>
+              </w:rPr>
             </w:r>
           </w:p>
         </w:tc>
@@ -615,11 +688,15 @@
             </w:pPr>
             <w:r>
               <w:rPr>
-                <w:rFonts w:ascii="Calibri" w:cs="Calibri" w:eastAsia="Calibri" w:hAnsi="Calibri"/>
                 <w:color w:val="1f3864"/>
                 <w:rtl w:val="0"/>
               </w:rPr>
-              <w:t xml:space="preserve">Rut</w:t>
+              <w:t xml:space="preserve">RUT</w:t>
+            </w:r>
+            <w:r>
+              <w:rPr>
+                <w:rtl w:val="0"/>
+              </w:rPr>
             </w:r>
           </w:p>
         </w:tc>
@@ -662,11 +739,15 @@
             </w:pPr>
             <w:r>
               <w:rPr>
-                <w:rFonts w:ascii="Calibri" w:cs="Calibri" w:eastAsia="Calibri" w:hAnsi="Calibri"/>
                 <w:color w:val="1f3864"/>
                 <w:rtl w:val="0"/>
               </w:rPr>
-              <w:t xml:space="preserve">Carrera</w:t>
+              <w:t xml:space="preserve">Degree program</w:t>
+            </w:r>
+            <w:r>
+              <w:rPr>
+                <w:rtl w:val="0"/>
+              </w:rPr>
             </w:r>
           </w:p>
         </w:tc>
@@ -709,11 +790,15 @@
             </w:pPr>
             <w:r>
               <w:rPr>
-                <w:rFonts w:ascii="Calibri" w:cs="Calibri" w:eastAsia="Calibri" w:hAnsi="Calibri"/>
                 <w:color w:val="1f3864"/>
                 <w:rtl w:val="0"/>
               </w:rPr>
-              <w:t xml:space="preserve">Sede</w:t>
+              <w:t xml:space="preserve">Campus</w:t>
+            </w:r>
+            <w:r>
+              <w:rPr>
+                <w:rtl w:val="0"/>
+              </w:rPr>
             </w:r>
           </w:p>
         </w:tc>
@@ -805,7 +890,7 @@
                 <w:szCs w:val="28"/>
                 <w:rtl w:val="0"/>
               </w:rPr>
-              <w:t xml:space="preserve">2. Descripción Proyecto APT</w:t>
+              <w:t xml:space="preserve">2. APT Project Description</w:t>
             </w:r>
           </w:p>
         </w:tc>
@@ -932,11 +1017,15 @@
             </w:pPr>
             <w:r>
               <w:rPr>
-                <w:rFonts w:ascii="Calibri" w:cs="Calibri" w:eastAsia="Calibri" w:hAnsi="Calibri"/>
                 <w:color w:val="1f3864"/>
                 <w:rtl w:val="0"/>
               </w:rPr>
-              <w:t xml:space="preserve">Nombre del proyecto</w:t>
+              <w:t xml:space="preserve">Project Name</w:t>
+            </w:r>
+            <w:r>
+              <w:rPr>
+                <w:rtl w:val="0"/>
+              </w:rPr>
             </w:r>
           </w:p>
         </w:tc>
@@ -987,11 +1076,15 @@
             </w:pPr>
             <w:r>
               <w:rPr>
-                <w:rFonts w:ascii="Calibri" w:cs="Calibri" w:eastAsia="Calibri" w:hAnsi="Calibri"/>
                 <w:color w:val="1f3864"/>
                 <w:rtl w:val="0"/>
               </w:rPr>
-              <w:t xml:space="preserve">Área (s) de desempeño(s)</w:t>
+              <w:t xml:space="preserve">Area(s) of performance</w:t>
+            </w:r>
+            <w:r>
+              <w:rPr>
+                <w:rtl w:val="0"/>
+              </w:rPr>
             </w:r>
           </w:p>
         </w:tc>
@@ -1080,11 +1173,15 @@
             </w:pPr>
             <w:r>
               <w:rPr>
-                <w:rFonts w:ascii="Calibri" w:cs="Calibri" w:eastAsia="Calibri" w:hAnsi="Calibri"/>
                 <w:color w:val="1f3864"/>
                 <w:rtl w:val="0"/>
               </w:rPr>
-              <w:t xml:space="preserve">Competencias </w:t>
+              <w:t xml:space="preserve">Competencies</w:t>
+            </w:r>
+            <w:r>
+              <w:rPr>
+                <w:rtl w:val="0"/>
+              </w:rPr>
             </w:r>
           </w:p>
           <w:p>
@@ -1274,7 +1371,7 @@
                 <w:szCs w:val="28"/>
                 <w:rtl w:val="0"/>
               </w:rPr>
-              <w:t xml:space="preserve">3. Fundamentación Proyecto APT</w:t>
+              <w:t xml:space="preserve">3. APT Project Rationale</w:t>
             </w:r>
           </w:p>
         </w:tc>
@@ -1327,6 +1424,13 @@
             </w:pPr>
             <w:r>
               <w:rPr>
+                <w:color w:val="1f3864"/>
+                <w:rtl w:val="0"/>
+              </w:rPr>
+              <w:t xml:space="preserve">Below are several fields that you must complete with the requested information. This section is intended for you to describe your project in detail and justify its relevance and pertinence</w:t>
+            </w:r>
+            <w:r>
+              <w:rPr>
                 <w:rFonts w:ascii="Calibri" w:cs="Calibri" w:eastAsia="Calibri" w:hAnsi="Calibri"/>
                 <w:b w:val="0"/>
                 <w:i w:val="0"/>
@@ -1340,7 +1444,7 @@
                 <w:vertAlign w:val="baseline"/>
                 <w:rtl w:val="0"/>
               </w:rPr>
-              <w:t xml:space="preserve">A continuación, se presentan distintos campos que debes completar con la información solicitada. Esta sección busca que describas en detalle tu proyecto y justifiques su relevancia y pertinencia.  </w:t>
+              <w:t xml:space="preserve">  </w:t>
             </w:r>
           </w:p>
         </w:tc>
@@ -1408,11 +1512,15 @@
             </w:pPr>
             <w:r>
               <w:rPr>
-                <w:rFonts w:ascii="Calibri" w:cs="Calibri" w:eastAsia="Calibri" w:hAnsi="Calibri"/>
                 <w:color w:val="1f3864"/>
                 <w:rtl w:val="0"/>
               </w:rPr>
-              <w:t xml:space="preserve">Relevancia del proyecto APT</w:t>
+              <w:t xml:space="preserve">Relevance of the APT Project</w:t>
+            </w:r>
+            <w:r>
+              <w:rPr>
+                <w:rtl w:val="0"/>
+              </w:rPr>
             </w:r>
           </w:p>
         </w:tc>
@@ -1544,11 +1652,15 @@
             </w:pPr>
             <w:r>
               <w:rPr>
-                <w:rFonts w:ascii="Calibri" w:cs="Calibri" w:eastAsia="Calibri" w:hAnsi="Calibri"/>
                 <w:color w:val="1f3864"/>
                 <w:rtl w:val="0"/>
               </w:rPr>
-              <w:t xml:space="preserve">Descripción del Proyecto APT</w:t>
+              <w:t xml:space="preserve">Description of the APT Project</w:t>
+            </w:r>
+            <w:r>
+              <w:rPr>
+                <w:rtl w:val="0"/>
+              </w:rPr>
             </w:r>
           </w:p>
         </w:tc>
@@ -1645,11 +1757,15 @@
             </w:pPr>
             <w:r>
               <w:rPr>
-                <w:rFonts w:ascii="Calibri" w:cs="Calibri" w:eastAsia="Calibri" w:hAnsi="Calibri"/>
                 <w:color w:val="1f3864"/>
                 <w:rtl w:val="0"/>
               </w:rPr>
-              <w:t xml:space="preserve">Pertinencia del proyecto con el perfil de egreso</w:t>
+              <w:t xml:space="preserve">Relevance of the Project to the Graduate Profile</w:t>
+            </w:r>
+            <w:r>
+              <w:rPr>
+                <w:rtl w:val="0"/>
+              </w:rPr>
             </w:r>
           </w:p>
         </w:tc>
@@ -1746,11 +1862,15 @@
             </w:pPr>
             <w:r>
               <w:rPr>
-                <w:rFonts w:ascii="Calibri" w:cs="Calibri" w:eastAsia="Calibri" w:hAnsi="Calibri"/>
                 <w:color w:val="1f3864"/>
                 <w:rtl w:val="0"/>
               </w:rPr>
-              <w:t xml:space="preserve">Relación con los intereses profesionales</w:t>
+              <w:t xml:space="preserve">Relation to Professional Interests</w:t>
+            </w:r>
+            <w:r>
+              <w:rPr>
+                <w:rtl w:val="0"/>
+              </w:rPr>
             </w:r>
           </w:p>
         </w:tc>
@@ -1929,11 +2049,15 @@
             </w:pPr>
             <w:r>
               <w:rPr>
-                <w:rFonts w:ascii="Calibri" w:cs="Calibri" w:eastAsia="Calibri" w:hAnsi="Calibri"/>
                 <w:color w:val="1f3864"/>
                 <w:rtl w:val="0"/>
               </w:rPr>
-              <w:t xml:space="preserve">Factibilidad de desarrollo del Proyecto APT</w:t>
+              <w:t xml:space="preserve">Feasibility of Developing the APT Project</w:t>
+            </w:r>
+            <w:r>
+              <w:rPr>
+                <w:rtl w:val="0"/>
+              </w:rPr>
             </w:r>
           </w:p>
         </w:tc>
@@ -2116,6 +2240,16 @@
       </w:pPr>
       <w:r>
         <w:rPr>
+          <w:b w:val="1"/>
+          <w:color w:val="4472c4"/>
+          <w:sz w:val="32"/>
+          <w:szCs w:val="32"/>
+          <w:rtl w:val="0"/>
+        </w:rPr>
+        <w:t xml:space="preserve">Part </w:t>
+      </w:r>
+      <w:r>
+        <w:rPr>
           <w:rFonts w:ascii="Calibri" w:cs="Calibri" w:eastAsia="Calibri" w:hAnsi="Calibri"/>
           <w:b w:val="1"/>
           <w:i w:val="0"/>
@@ -2129,7 +2263,7 @@
           <w:vertAlign w:val="baseline"/>
           <w:rtl w:val="0"/>
         </w:rPr>
-        <w:t xml:space="preserve">PARTE II </w:t>
+        <w:t xml:space="preserve">II </w:t>
       </w:r>
     </w:p>
     <w:tbl>
@@ -2184,7 +2318,7 @@
                 <w:szCs w:val="28"/>
                 <w:rtl w:val="0"/>
               </w:rPr>
-              <w:t xml:space="preserve">4. Objetivos</w:t>
+              <w:t xml:space="preserve">4. Objectives</w:t>
             </w:r>
           </w:p>
         </w:tc>
@@ -2237,20 +2371,15 @@
             </w:pPr>
             <w:r>
               <w:rPr>
-                <w:rFonts w:ascii="Calibri" w:cs="Calibri" w:eastAsia="Calibri" w:hAnsi="Calibri"/>
-                <w:b w:val="0"/>
-                <w:i w:val="0"/>
-                <w:smallCaps w:val="0"/>
-                <w:strike w:val="0"/>
                 <w:color w:val="1f3864"/>
-                <w:sz w:val="22"/>
-                <w:szCs w:val="22"/>
-                <w:u w:val="none"/>
-                <w:shd w:fill="auto" w:val="clear"/>
-                <w:vertAlign w:val="baseline"/>
-                <w:rtl w:val="0"/>
-              </w:rPr>
-              <w:t xml:space="preserve">En este apartado debes definir objetivos generales y específicos del Proyecto APT. Es importante aclarar que los objetivos se deben plantear en forma clara, concisa y sin dar mayores explicaciones, es decir, deben entenderse por sí solos. Se sugiere redactarlos utilizando un verbo en infinitivo, pues ello obliga a precisar acciones concretas.</w:t>
+                <w:rtl w:val="0"/>
+              </w:rPr>
+              <w:t xml:space="preserve">In this section, you must define the general and specific objectives of the APT Project. It is important to clarify that the objectives should be stated clearly and concisely, without further explanations; in other words, they must be self-explanatory. It is suggested to write them using an infinitive verb, as this requires specifying concrete actions.</w:t>
+            </w:r>
+            <w:r>
+              <w:rPr>
+                <w:rtl w:val="0"/>
+              </w:rPr>
             </w:r>
           </w:p>
         </w:tc>
@@ -2318,11 +2447,15 @@
             </w:pPr>
             <w:r>
               <w:rPr>
-                <w:rFonts w:ascii="Calibri" w:cs="Calibri" w:eastAsia="Calibri" w:hAnsi="Calibri"/>
                 <w:color w:val="1f3864"/>
                 <w:rtl w:val="0"/>
               </w:rPr>
-              <w:t xml:space="preserve">Objetivo general</w:t>
+              <w:t xml:space="preserve">General Objective</w:t>
+            </w:r>
+            <w:r>
+              <w:rPr>
+                <w:rtl w:val="0"/>
+              </w:rPr>
             </w:r>
           </w:p>
         </w:tc>
@@ -2378,11 +2511,15 @@
             </w:pPr>
             <w:r>
               <w:rPr>
-                <w:rFonts w:ascii="Calibri" w:cs="Calibri" w:eastAsia="Calibri" w:hAnsi="Calibri"/>
                 <w:color w:val="1f3864"/>
                 <w:rtl w:val="0"/>
               </w:rPr>
-              <w:t xml:space="preserve">Objetivos específicos</w:t>
+              <w:t xml:space="preserve">Specific Objectives</w:t>
+            </w:r>
+            <w:r>
+              <w:rPr>
+                <w:rtl w:val="0"/>
+              </w:rPr>
             </w:r>
           </w:p>
         </w:tc>
@@ -2683,7 +2820,7 @@
                 <w:szCs w:val="28"/>
                 <w:rtl w:val="0"/>
               </w:rPr>
-              <w:t xml:space="preserve">5. Metodología</w:t>
+              <w:t xml:space="preserve">5. Methodology </w:t>
             </w:r>
           </w:p>
         </w:tc>
@@ -2736,6 +2873,13 @@
             </w:pPr>
             <w:r>
               <w:rPr>
+                <w:color w:val="1f3864"/>
+                <w:rtl w:val="0"/>
+              </w:rPr>
+              <w:t xml:space="preserve">In the following section, you must describe the methodology, specific to your discipline, that you will use to carry out the previously described APT project, including the stages and work methods</w:t>
+            </w:r>
+            <w:r>
+              <w:rPr>
                 <w:rFonts w:ascii="Calibri" w:cs="Calibri" w:eastAsia="Calibri" w:hAnsi="Calibri"/>
                 <w:b w:val="0"/>
                 <w:i w:val="0"/>
@@ -2749,7 +2893,7 @@
                 <w:vertAlign w:val="baseline"/>
                 <w:rtl w:val="0"/>
               </w:rPr>
-              <w:t xml:space="preserve">En el siguiente apartado deberás describir la metodología, propia de tu disciplina, que utilizarás para resolver el proyecto APT antes descrito, incluyendo las etapas y métodos de trabajo.  </w:t>
+              <w:t xml:space="preserve">.  </w:t>
             </w:r>
           </w:p>
         </w:tc>
@@ -2813,11 +2957,15 @@
             </w:pPr>
             <w:r>
               <w:rPr>
-                <w:rFonts w:ascii="Calibri" w:cs="Calibri" w:eastAsia="Calibri" w:hAnsi="Calibri"/>
                 <w:color w:val="1f3864"/>
                 <w:rtl w:val="0"/>
               </w:rPr>
               <w:t xml:space="preserve">Descripción de la Metodología</w:t>
+            </w:r>
+            <w:r>
+              <w:rPr>
+                <w:rtl w:val="0"/>
+              </w:rPr>
             </w:r>
           </w:p>
         </w:tc>
@@ -3233,7 +3381,7 @@
                 <w:szCs w:val="28"/>
                 <w:rtl w:val="0"/>
               </w:rPr>
-              <w:t xml:space="preserve">6. Evidencias</w:t>
+              <w:t xml:space="preserve">6. Evidence</w:t>
             </w:r>
           </w:p>
         </w:tc>
@@ -3259,24 +3407,10 @@
             </w:pPr>
             <w:r>
               <w:rPr>
-                <w:rFonts w:ascii="Calibri" w:cs="Calibri" w:eastAsia="Calibri" w:hAnsi="Calibri"/>
-                <w:color w:val="1f3864"/>
-                <w:rtl w:val="0"/>
-              </w:rPr>
-              <w:t xml:space="preserve">A continuación, describe qué evidencias serán evaluadas en el informe de avance y en el informe final de tu proyecto APT. Estas evidencias deben ser acordadas con tu docente. </w:t>
-            </w:r>
-            <w:r>
-              <w:rPr>
-                <w:rtl w:val="0"/>
-              </w:rPr>
-              <w:t xml:space="preserve"> Se entenderá por evidencia los productos que se desarrollen durante el proyecto y cuyo propósito sea visibilizar o documentar cómo se ha implementado el trabajo. </w:t>
-            </w:r>
-            <w:r>
-              <w:rPr>
                 <w:color w:val="595959"/>
                 <w:rtl w:val="0"/>
               </w:rPr>
-              <w:t xml:space="preserve"> </w:t>
+              <w:t xml:space="preserve">Below, describe which pieces of evidence will be evaluated in the progress report and in the final report of your APT project. These pieces of evidence must be agreed upon with your instructor. Evidence will be understood as the deliverables developed during the project whose purpose is to make visible or document how the work has been implemented</w:t>
             </w:r>
           </w:p>
         </w:tc>
@@ -3376,22 +3510,23 @@
             </w:pPr>
             <w:r>
               <w:rPr>
-                <w:rFonts w:ascii="Calibri" w:cs="Calibri" w:eastAsia="Calibri" w:hAnsi="Calibri"/>
                 <w:b w:val="1"/>
-                <w:i w:val="0"/>
-                <w:smallCaps w:val="0"/>
-                <w:strike w:val="0"/>
                 <w:color w:val="1f3864"/>
-                <w:sz w:val="22"/>
-                <w:szCs w:val="22"/>
-                <w:u w:val="none"/>
-                <w:shd w:fill="auto" w:val="clear"/>
-                <w:vertAlign w:val="baseline"/>
-                <w:rtl w:val="0"/>
-              </w:rPr>
-              <w:t xml:space="preserve">Tipo de evidencia </w:t>
-            </w:r>
-          </w:p>
+                <w:rtl w:val="0"/>
+              </w:rPr>
+              <w:t xml:space="preserve">Type of Evidence</w:t>
+            </w:r>
+            <w:r>
+              <w:rPr>
+                <w:rtl w:val="0"/>
+              </w:rPr>
+            </w:r>
+          </w:p>
+        </w:tc>
+        <w:tc>
+          <w:tcPr>
+            <w:vAlign w:val="center"/>
+          </w:tcPr>
           <w:p>
             <w:pPr>
               <w:keepNext w:val="0"/>
@@ -3429,20 +3564,16 @@
             </w:pPr>
             <w:r>
               <w:rPr>
-                <w:rFonts w:ascii="Calibri" w:cs="Calibri" w:eastAsia="Calibri" w:hAnsi="Calibri"/>
                 <w:b w:val="1"/>
-                <w:i w:val="0"/>
-                <w:smallCaps w:val="0"/>
-                <w:strike w:val="0"/>
                 <w:color w:val="1f3864"/>
-                <w:sz w:val="22"/>
-                <w:szCs w:val="22"/>
-                <w:u w:val="none"/>
-                <w:shd w:fill="auto" w:val="clear"/>
-                <w:vertAlign w:val="baseline"/>
-                <w:rtl w:val="0"/>
-              </w:rPr>
-              <w:t xml:space="preserve">(avance o final)</w:t>
+                <w:rtl w:val="0"/>
+              </w:rPr>
+              <w:t xml:space="preserve">Name Evidence</w:t>
+            </w:r>
+            <w:r>
+              <w:rPr>
+                <w:rtl w:val="0"/>
+              </w:rPr>
             </w:r>
           </w:p>
         </w:tc>
@@ -3487,20 +3618,16 @@
             </w:pPr>
             <w:r>
               <w:rPr>
-                <w:rFonts w:ascii="Calibri" w:cs="Calibri" w:eastAsia="Calibri" w:hAnsi="Calibri"/>
                 <w:b w:val="1"/>
-                <w:i w:val="0"/>
-                <w:smallCaps w:val="0"/>
-                <w:strike w:val="0"/>
                 <w:color w:val="1f3864"/>
-                <w:sz w:val="22"/>
-                <w:szCs w:val="22"/>
-                <w:u w:val="none"/>
-                <w:shd w:fill="auto" w:val="clear"/>
-                <w:vertAlign w:val="baseline"/>
-                <w:rtl w:val="0"/>
-              </w:rPr>
-              <w:t xml:space="preserve">Nombre de la evidencia</w:t>
+                <w:rtl w:val="0"/>
+              </w:rPr>
+              <w:t xml:space="preserve">Description</w:t>
+            </w:r>
+            <w:r>
+              <w:rPr>
+                <w:rtl w:val="0"/>
+              </w:rPr>
             </w:r>
           </w:p>
         </w:tc>
@@ -3545,78 +3672,16 @@
             </w:pPr>
             <w:r>
               <w:rPr>
-                <w:rFonts w:ascii="Calibri" w:cs="Calibri" w:eastAsia="Calibri" w:hAnsi="Calibri"/>
                 <w:b w:val="1"/>
-                <w:i w:val="0"/>
-                <w:smallCaps w:val="0"/>
-                <w:strike w:val="0"/>
                 <w:color w:val="1f3864"/>
-                <w:sz w:val="22"/>
-                <w:szCs w:val="22"/>
-                <w:u w:val="none"/>
-                <w:shd w:fill="auto" w:val="clear"/>
-                <w:vertAlign w:val="baseline"/>
-                <w:rtl w:val="0"/>
-              </w:rPr>
-              <w:t xml:space="preserve">Descripción</w:t>
-            </w:r>
-          </w:p>
-        </w:tc>
-        <w:tc>
-          <w:tcPr>
-            <w:vAlign w:val="center"/>
-          </w:tcPr>
-          <w:p>
-            <w:pPr>
-              <w:keepNext w:val="0"/>
-              <w:keepLines w:val="0"/>
-              <w:pageBreakBefore w:val="0"/>
-              <w:widowControl w:val="1"/>
-              <w:pBdr>
-                <w:top w:space="0" w:sz="0" w:val="nil"/>
-                <w:left w:space="0" w:sz="0" w:val="nil"/>
-                <w:bottom w:space="0" w:sz="0" w:val="nil"/>
-                <w:right w:space="0" w:sz="0" w:val="nil"/>
-                <w:between w:space="0" w:sz="0" w:val="nil"/>
-              </w:pBdr>
-              <w:shd w:fill="auto" w:val="clear"/>
-              <w:tabs>
-                <w:tab w:val="center" w:leader="none" w:pos="4419"/>
-                <w:tab w:val="right" w:leader="none" w:pos="8838"/>
-              </w:tabs>
-              <w:spacing w:after="0" w:before="0" w:line="240" w:lineRule="auto"/>
-              <w:ind w:left="0" w:right="0" w:firstLine="0"/>
-              <w:jc w:val="center"/>
-              <w:rPr>
-                <w:rFonts w:ascii="Calibri" w:cs="Calibri" w:eastAsia="Calibri" w:hAnsi="Calibri"/>
-                <w:b w:val="1"/>
-                <w:i w:val="0"/>
-                <w:smallCaps w:val="0"/>
-                <w:strike w:val="0"/>
-                <w:color w:val="1f3864"/>
-                <w:sz w:val="22"/>
-                <w:szCs w:val="22"/>
-                <w:u w:val="none"/>
-                <w:shd w:fill="auto" w:val="clear"/>
-                <w:vertAlign w:val="baseline"/>
-              </w:rPr>
-            </w:pPr>
-            <w:r>
-              <w:rPr>
-                <w:rFonts w:ascii="Calibri" w:cs="Calibri" w:eastAsia="Calibri" w:hAnsi="Calibri"/>
-                <w:b w:val="1"/>
-                <w:i w:val="0"/>
-                <w:smallCaps w:val="0"/>
-                <w:strike w:val="0"/>
-                <w:color w:val="1f3864"/>
-                <w:sz w:val="22"/>
-                <w:szCs w:val="22"/>
-                <w:u w:val="none"/>
-                <w:shd w:fill="auto" w:val="clear"/>
-                <w:vertAlign w:val="baseline"/>
-                <w:rtl w:val="0"/>
-              </w:rPr>
-              <w:t xml:space="preserve">Justificación</w:t>
+                <w:rtl w:val="0"/>
+              </w:rPr>
+              <w:t xml:space="preserve">Justification </w:t>
+            </w:r>
+            <w:r>
+              <w:rPr>
+                <w:rtl w:val="0"/>
+              </w:rPr>
             </w:r>
           </w:p>
         </w:tc>
@@ -4719,7 +4784,7 @@
                 <w:szCs w:val="28"/>
                 <w:rtl w:val="0"/>
               </w:rPr>
-              <w:t xml:space="preserve">7. Plan de Trabajo</w:t>
+              <w:t xml:space="preserve">7. Work Plan</w:t>
             </w:r>
           </w:p>
         </w:tc>
@@ -4772,20 +4837,15 @@
             </w:pPr>
             <w:r>
               <w:rPr>
-                <w:rFonts w:ascii="Calibri" w:cs="Calibri" w:eastAsia="Calibri" w:hAnsi="Calibri"/>
-                <w:b w:val="0"/>
-                <w:i w:val="0"/>
-                <w:smallCaps w:val="0"/>
-                <w:strike w:val="0"/>
                 <w:color w:val="1f3864"/>
-                <w:sz w:val="22"/>
-                <w:szCs w:val="22"/>
-                <w:u w:val="none"/>
-                <w:shd w:fill="auto" w:val="clear"/>
-                <w:vertAlign w:val="baseline"/>
-                <w:rtl w:val="0"/>
-              </w:rPr>
-              <w:t xml:space="preserve">En la siguiente tabla define la planificación de tu Proyecto APT de acuerdo a lo requerido.</w:t>
+                <w:rtl w:val="0"/>
+              </w:rPr>
+              <w:t xml:space="preserve">In the following table, define the planning of your APT Project according to the requirements</w:t>
+            </w:r>
+            <w:r>
+              <w:rPr>
+                <w:rtl w:val="0"/>
+              </w:rPr>
             </w:r>
           </w:p>
         </w:tc>
@@ -4810,7 +4870,7 @@
     <w:tbl>
       <w:tblPr>
         <w:tblStyle w:val="Table14"/>
-        <w:tblW w:w="11061.0" w:type="dxa"/>
+        <w:tblW w:w="11061.000000000002" w:type="dxa"/>
         <w:jc w:val="center"/>
         <w:tblBorders>
           <w:top w:color="bfbfbf" w:space="0" w:sz="4" w:val="single"/>
@@ -4824,22 +4884,24 @@
         <w:tblLook w:val="0400"/>
       </w:tblPr>
       <w:tblGrid>
-        <w:gridCol w:w="1580"/>
-        <w:gridCol w:w="1580"/>
-        <w:gridCol w:w="1580"/>
-        <w:gridCol w:w="1580"/>
-        <w:gridCol w:w="1580"/>
-        <w:gridCol w:w="1580"/>
-        <w:gridCol w:w="1581"/>
+        <w:gridCol w:w="1382.5156237639428"/>
+        <w:gridCol w:w="1382.5156237639428"/>
+        <w:gridCol w:w="1382.5156237639428"/>
+        <w:gridCol w:w="1382.5156237639428"/>
+        <w:gridCol w:w="1382.5156237639428"/>
+        <w:gridCol w:w="1382.5156237639428"/>
+        <w:gridCol w:w="1382.5156237639428"/>
+        <w:gridCol w:w="1383.390633652401"/>
         <w:tblGridChange w:id="0">
           <w:tblGrid>
-            <w:gridCol w:w="1580"/>
-            <w:gridCol w:w="1580"/>
-            <w:gridCol w:w="1580"/>
-            <w:gridCol w:w="1580"/>
-            <w:gridCol w:w="1580"/>
-            <w:gridCol w:w="1580"/>
-            <w:gridCol w:w="1581"/>
+            <w:gridCol w:w="1382.5156237639428"/>
+            <w:gridCol w:w="1382.5156237639428"/>
+            <w:gridCol w:w="1382.5156237639428"/>
+            <w:gridCol w:w="1382.5156237639428"/>
+            <w:gridCol w:w="1382.5156237639428"/>
+            <w:gridCol w:w="1382.5156237639428"/>
+            <w:gridCol w:w="1382.5156237639428"/>
+            <w:gridCol w:w="1383.390633652401"/>
           </w:tblGrid>
         </w:tblGridChange>
       </w:tblGrid>
@@ -4850,7 +4912,7 @@
         </w:trPr>
         <w:tc>
           <w:tcPr>
-            <w:gridSpan w:val="7"/>
+            <w:gridSpan w:val="8"/>
           </w:tcPr>
           <w:p>
             <w:pPr>
@@ -4862,12 +4924,11 @@
             </w:pPr>
             <w:r>
               <w:rPr>
-                <w:rFonts w:ascii="Calibri" w:cs="Calibri" w:eastAsia="Calibri" w:hAnsi="Calibri"/>
                 <w:b w:val="1"/>
                 <w:color w:val="1f3864"/>
                 <w:rtl w:val="0"/>
               </w:rPr>
-              <w:t xml:space="preserve">Plan de Trabajo Proyecto APT</w:t>
+              <w:t xml:space="preserve">APT Project Work Plan</w:t>
             </w:r>
             <w:r>
               <w:rPr>
@@ -4896,13 +4957,17 @@
             </w:pPr>
             <w:r>
               <w:rPr>
-                <w:rFonts w:ascii="Calibri" w:cs="Calibri" w:eastAsia="Calibri" w:hAnsi="Calibri"/>
                 <w:color w:val="1f3864"/>
                 <w:sz w:val="18"/>
                 <w:szCs w:val="18"/>
                 <w:rtl w:val="0"/>
               </w:rPr>
-              <w:t xml:space="preserve">Competencia o unidades de competencias</w:t>
+              <w:t xml:space="preserve">Competency or Units of Competencies</w:t>
+            </w:r>
+            <w:r>
+              <w:rPr>
+                <w:rtl w:val="0"/>
+              </w:rPr>
             </w:r>
           </w:p>
         </w:tc>
@@ -4920,11 +4985,41 @@
             </w:pPr>
             <w:r>
               <w:rPr>
+                <w:color w:val="1f3864"/>
+                <w:rtl w:val="0"/>
+              </w:rPr>
+              <w:t xml:space="preserve">Name of Activities/Tasks</w:t>
+            </w:r>
+            <w:r>
+              <w:rPr>
+                <w:rtl w:val="0"/>
+              </w:rPr>
+            </w:r>
+          </w:p>
+        </w:tc>
+        <w:tc>
+          <w:tcPr>
+            <w:vAlign w:val="center"/>
+          </w:tcPr>
+          <w:p>
+            <w:pPr>
+              <w:jc w:val="center"/>
+              <w:rPr>
                 <w:rFonts w:ascii="Calibri" w:cs="Calibri" w:eastAsia="Calibri" w:hAnsi="Calibri"/>
                 <w:color w:val="1f3864"/>
-                <w:rtl w:val="0"/>
-              </w:rPr>
-              <w:t xml:space="preserve">Nombre de  Actividades/Tareas</w:t>
+              </w:rPr>
+            </w:pPr>
+            <w:r>
+              <w:rPr>
+                <w:color w:val="1f3864"/>
+                <w:rtl w:val="0"/>
+              </w:rPr>
+              <w:t xml:space="preserve">Description of Activities/Tasks</w:t>
+            </w:r>
+            <w:r>
+              <w:rPr>
+                <w:rtl w:val="0"/>
+              </w:rPr>
             </w:r>
           </w:p>
         </w:tc>
@@ -4942,16 +5037,42 @@
             </w:pPr>
             <w:r>
               <w:rPr>
+                <w:rtl w:val="0"/>
+              </w:rPr>
+            </w:r>
+          </w:p>
+        </w:tc>
+        <w:tc>
+          <w:tcPr>
+            <w:vAlign w:val="center"/>
+          </w:tcPr>
+          <w:p>
+            <w:pPr>
+              <w:jc w:val="center"/>
+              <w:rPr>
                 <w:rFonts w:ascii="Calibri" w:cs="Calibri" w:eastAsia="Calibri" w:hAnsi="Calibri"/>
                 <w:color w:val="1f3864"/>
-                <w:rtl w:val="0"/>
-              </w:rPr>
-              <w:t xml:space="preserve">Descripción Actividades/Tareas</w:t>
-            </w:r>
-          </w:p>
-        </w:tc>
-        <w:tc>
-          <w:tcPr>
+              </w:rPr>
+            </w:pPr>
+            <w:r>
+              <w:rPr>
+                <w:color w:val="1f3864"/>
+                <w:rtl w:val="0"/>
+              </w:rPr>
+              <w:t xml:space="preserve">Resources</w:t>
+            </w:r>
+            <w:r>
+              <w:rPr>
+                <w:rtl w:val="0"/>
+              </w:rPr>
+            </w:r>
+          </w:p>
+        </w:tc>
+        <w:tc>
+          <w:tcPr>
+            <w:tcBorders>
+              <w:right w:color="ffffff" w:space="0" w:sz="4" w:val="single"/>
+            </w:tcBorders>
             <w:vAlign w:val="center"/>
           </w:tcPr>
           <w:p>
@@ -4964,19 +5085,38 @@
             </w:pPr>
             <w:r>
               <w:rPr>
+                <w:color w:val="1f3864"/>
+                <w:rtl w:val="0"/>
+              </w:rPr>
+              <w:t xml:space="preserve">Duration of the Activity</w:t>
+            </w:r>
+            <w:r>
+              <w:rPr>
+                <w:rtl w:val="0"/>
+              </w:rPr>
+            </w:r>
+          </w:p>
+          <w:p>
+            <w:pPr>
+              <w:jc w:val="center"/>
+              <w:rPr>
                 <w:rFonts w:ascii="Calibri" w:cs="Calibri" w:eastAsia="Calibri" w:hAnsi="Calibri"/>
                 <w:color w:val="1f3864"/>
-                <w:rtl w:val="0"/>
-              </w:rPr>
-              <w:t xml:space="preserve">Recursos</w:t>
-            </w:r>
-          </w:p>
-        </w:tc>
-        <w:tc>
-          <w:tcPr>
-            <w:tcBorders>
-              <w:right w:color="ffffff" w:space="0" w:sz="4" w:val="single"/>
-            </w:tcBorders>
+              </w:rPr>
+            </w:pPr>
+            <w:r>
+              <w:rPr>
+                <w:rtl w:val="0"/>
+              </w:rPr>
+            </w:r>
+          </w:p>
+        </w:tc>
+        <w:tc>
+          <w:tcPr>
+            <w:tcBorders>
+              <w:left w:color="ffffff" w:space="0" w:sz="4" w:val="single"/>
+            </w:tcBorders>
+            <w:shd w:fill="d9d9d9" w:val="clear"/>
             <w:vAlign w:val="center"/>
           </w:tcPr>
           <w:p>
@@ -4989,86 +5129,49 @@
             </w:pPr>
             <w:r>
               <w:rPr>
+                <w:color w:val="1f3864"/>
+                <w:rtl w:val="0"/>
+              </w:rPr>
+              <w:t xml:space="preserve">Person in Charge</w:t>
+            </w:r>
+            <w:r>
+              <w:rPr>
+                <w:rtl w:val="0"/>
+              </w:rPr>
+            </w:r>
+          </w:p>
+        </w:tc>
+        <w:tc>
+          <w:tcPr>
+            <w:vAlign w:val="center"/>
+          </w:tcPr>
+          <w:p>
+            <w:pPr>
+              <w:jc w:val="center"/>
+              <w:rPr>
                 <w:rFonts w:ascii="Calibri" w:cs="Calibri" w:eastAsia="Calibri" w:hAnsi="Calibri"/>
                 <w:color w:val="1f3864"/>
-                <w:rtl w:val="0"/>
-              </w:rPr>
-              <w:t xml:space="preserve">Duración de la actividad</w:t>
-            </w:r>
-          </w:p>
-          <w:p>
-            <w:pPr>
-              <w:jc w:val="center"/>
-              <w:rPr>
-                <w:rFonts w:ascii="Calibri" w:cs="Calibri" w:eastAsia="Calibri" w:hAnsi="Calibri"/>
+              </w:rPr>
+            </w:pPr>
+            <w:r>
+              <w:rPr>
+                <w:b w:val="1"/>
                 <w:color w:val="1f3864"/>
-              </w:rPr>
-            </w:pPr>
-            <w:r>
-              <w:rPr>
-                <w:rtl w:val="0"/>
-              </w:rPr>
-            </w:r>
-          </w:p>
-        </w:tc>
-        <w:tc>
-          <w:tcPr>
-            <w:tcBorders>
-              <w:left w:color="ffffff" w:space="0" w:sz="4" w:val="single"/>
-            </w:tcBorders>
-            <w:shd w:fill="d9d9d9" w:val="clear"/>
-            <w:vAlign w:val="center"/>
-          </w:tcPr>
-          <w:p>
-            <w:pPr>
-              <w:jc w:val="center"/>
-              <w:rPr>
-                <w:rFonts w:ascii="Calibri" w:cs="Calibri" w:eastAsia="Calibri" w:hAnsi="Calibri"/>
+                <w:rtl w:val="0"/>
+              </w:rPr>
+              <w:t xml:space="preserve">Remarks</w:t>
+            </w:r>
+            <w:r>
+              <w:rPr>
                 <w:color w:val="1f3864"/>
-              </w:rPr>
-            </w:pPr>
-            <w:r>
-              <w:rPr>
-                <w:rFonts w:ascii="Calibri" w:cs="Calibri" w:eastAsia="Calibri" w:hAnsi="Calibri"/>
-                <w:color w:val="1f3864"/>
-                <w:rtl w:val="0"/>
-              </w:rPr>
-              <w:t xml:space="preserve">Responsable</w:t>
-            </w:r>
-            <w:r>
-              <w:rPr>
-                <w:rFonts w:ascii="Calibri" w:cs="Calibri" w:eastAsia="Calibri" w:hAnsi="Calibri"/>
-                <w:color w:val="1f3864"/>
-                <w:vertAlign w:val="superscript"/>
-              </w:rPr>
-              <w:footnoteReference w:customMarkFollows="0" w:id="0"/>
-            </w:r>
-            <w:r>
-              <w:rPr>
-                <w:rtl w:val="0"/>
-              </w:rPr>
-            </w:r>
-          </w:p>
-        </w:tc>
-        <w:tc>
-          <w:tcPr>
-            <w:vAlign w:val="center"/>
-          </w:tcPr>
-          <w:p>
-            <w:pPr>
-              <w:jc w:val="center"/>
-              <w:rPr>
-                <w:rFonts w:ascii="Calibri" w:cs="Calibri" w:eastAsia="Calibri" w:hAnsi="Calibri"/>
-                <w:color w:val="1f3864"/>
-              </w:rPr>
-            </w:pPr>
-            <w:r>
-              <w:rPr>
-                <w:rFonts w:ascii="Calibri" w:cs="Calibri" w:eastAsia="Calibri" w:hAnsi="Calibri"/>
-                <w:color w:val="1f3864"/>
-                <w:rtl w:val="0"/>
-              </w:rPr>
-              <w:t xml:space="preserve">Observaciones</w:t>
+                <w:rtl w:val="0"/>
+              </w:rPr>
+              <w:t xml:space="preserve"> </w:t>
+            </w:r>
+            <w:r>
+              <w:rPr>
+                <w:rtl w:val="0"/>
+              </w:rPr>
             </w:r>
           </w:p>
         </w:tc>
@@ -5158,6 +5261,24 @@
             <w:pPr>
               <w:jc w:val="both"/>
               <w:rPr>
+                <w:b w:val="1"/>
+                <w:sz w:val="18"/>
+                <w:szCs w:val="18"/>
+              </w:rPr>
+            </w:pPr>
+            <w:r>
+              <w:rPr>
+                <w:rtl w:val="0"/>
+              </w:rPr>
+            </w:r>
+          </w:p>
+        </w:tc>
+        <w:tc>
+          <w:tcPr/>
+          <w:p>
+            <w:pPr>
+              <w:jc w:val="both"/>
+              <w:rPr>
                 <w:rFonts w:ascii="Calibri" w:cs="Calibri" w:eastAsia="Calibri" w:hAnsi="Calibri"/>
                 <w:i w:val="1"/>
                 <w:color w:val="548dd4"/>
@@ -5367,6 +5488,25 @@
             <w:pPr>
               <w:jc w:val="both"/>
               <w:rPr>
+                <w:i w:val="1"/>
+                <w:color w:val="548dd4"/>
+                <w:sz w:val="18"/>
+                <w:szCs w:val="18"/>
+              </w:rPr>
+            </w:pPr>
+            <w:r>
+              <w:rPr>
+                <w:rtl w:val="0"/>
+              </w:rPr>
+            </w:r>
+          </w:p>
+        </w:tc>
+        <w:tc>
+          <w:tcPr/>
+          <w:p>
+            <w:pPr>
+              <w:jc w:val="both"/>
+              <w:rPr>
                 <w:rFonts w:ascii="Calibri" w:cs="Calibri" w:eastAsia="Calibri" w:hAnsi="Calibri"/>
                 <w:i w:val="1"/>
                 <w:color w:val="548dd4"/>
@@ -5592,6 +5732,25 @@
             <w:pPr>
               <w:jc w:val="both"/>
               <w:rPr>
+                <w:i w:val="1"/>
+                <w:color w:val="548dd4"/>
+                <w:sz w:val="18"/>
+                <w:szCs w:val="18"/>
+              </w:rPr>
+            </w:pPr>
+            <w:r>
+              <w:rPr>
+                <w:rtl w:val="0"/>
+              </w:rPr>
+            </w:r>
+          </w:p>
+        </w:tc>
+        <w:tc>
+          <w:tcPr/>
+          <w:p>
+            <w:pPr>
+              <w:jc w:val="both"/>
+              <w:rPr>
                 <w:rFonts w:ascii="Calibri" w:cs="Calibri" w:eastAsia="Calibri" w:hAnsi="Calibri"/>
                 <w:i w:val="1"/>
                 <w:color w:val="548dd4"/>
@@ -5811,6 +5970,25 @@
             <w:pPr>
               <w:jc w:val="both"/>
               <w:rPr>
+                <w:i w:val="1"/>
+                <w:color w:val="548dd4"/>
+                <w:sz w:val="18"/>
+                <w:szCs w:val="18"/>
+              </w:rPr>
+            </w:pPr>
+            <w:r>
+              <w:rPr>
+                <w:rtl w:val="0"/>
+              </w:rPr>
+            </w:r>
+          </w:p>
+        </w:tc>
+        <w:tc>
+          <w:tcPr/>
+          <w:p>
+            <w:pPr>
+              <w:jc w:val="both"/>
+              <w:rPr>
                 <w:rFonts w:ascii="Calibri" w:cs="Calibri" w:eastAsia="Calibri" w:hAnsi="Calibri"/>
                 <w:i w:val="1"/>
                 <w:color w:val="548dd4"/>
@@ -6030,6 +6208,25 @@
             <w:pPr>
               <w:jc w:val="both"/>
               <w:rPr>
+                <w:i w:val="1"/>
+                <w:color w:val="548dd4"/>
+                <w:sz w:val="18"/>
+                <w:szCs w:val="18"/>
+              </w:rPr>
+            </w:pPr>
+            <w:r>
+              <w:rPr>
+                <w:rtl w:val="0"/>
+              </w:rPr>
+            </w:r>
+          </w:p>
+        </w:tc>
+        <w:tc>
+          <w:tcPr/>
+          <w:p>
+            <w:pPr>
+              <w:jc w:val="both"/>
+              <w:rPr>
                 <w:rFonts w:ascii="Calibri" w:cs="Calibri" w:eastAsia="Calibri" w:hAnsi="Calibri"/>
                 <w:i w:val="1"/>
                 <w:color w:val="548dd4"/>
@@ -6249,6 +6446,25 @@
             <w:pPr>
               <w:jc w:val="both"/>
               <w:rPr>
+                <w:i w:val="1"/>
+                <w:color w:val="548dd4"/>
+                <w:sz w:val="18"/>
+                <w:szCs w:val="18"/>
+              </w:rPr>
+            </w:pPr>
+            <w:r>
+              <w:rPr>
+                <w:rtl w:val="0"/>
+              </w:rPr>
+            </w:r>
+          </w:p>
+        </w:tc>
+        <w:tc>
+          <w:tcPr/>
+          <w:p>
+            <w:pPr>
+              <w:jc w:val="both"/>
+              <w:rPr>
                 <w:rFonts w:ascii="Calibri" w:cs="Calibri" w:eastAsia="Calibri" w:hAnsi="Calibri"/>
                 <w:i w:val="1"/>
                 <w:color w:val="548dd4"/>
@@ -6455,6 +6671,25 @@
               </w:rPr>
               <w:t xml:space="preserve">Prepare final demo, documentation, and presentation for committee.</w:t>
             </w:r>
+            <w:r>
+              <w:rPr>
+                <w:rtl w:val="0"/>
+              </w:rPr>
+            </w:r>
+          </w:p>
+        </w:tc>
+        <w:tc>
+          <w:tcPr/>
+          <w:p>
+            <w:pPr>
+              <w:jc w:val="both"/>
+              <w:rPr>
+                <w:i w:val="1"/>
+                <w:color w:val="548dd4"/>
+                <w:sz w:val="18"/>
+                <w:szCs w:val="18"/>
+              </w:rPr>
+            </w:pPr>
             <w:r>
               <w:rPr>
                 <w:rtl w:val="0"/>
@@ -6661,7 +6896,7 @@
                 <w:szCs w:val="28"/>
                 <w:rtl w:val="0"/>
               </w:rPr>
-              <w:t xml:space="preserve">8. Carta Gantt </w:t>
+              <w:t xml:space="preserve">8. Gantt Chart </w:t>
             </w:r>
           </w:p>
         </w:tc>
@@ -6714,6 +6949,13 @@
             </w:pPr>
             <w:r>
               <w:rPr>
+                <w:color w:val="1f3864"/>
+                <w:rtl w:val="0"/>
+              </w:rPr>
+              <w:t xml:space="preserve">Find a Gantt chart format that suits you and use it to organize the activities planned in the previous section, taking into account the period assigned for the development of your APT Project. You must maintain the academic term timeline across the three phases included in the Capstone Portfolio course</w:t>
+            </w:r>
+            <w:r>
+              <w:rPr>
                 <w:rFonts w:ascii="Calibri" w:cs="Calibri" w:eastAsia="Calibri" w:hAnsi="Calibri"/>
                 <w:b w:val="0"/>
                 <w:i w:val="0"/>
@@ -6727,7 +6969,7 @@
                 <w:vertAlign w:val="baseline"/>
                 <w:rtl w:val="0"/>
               </w:rPr>
-              <w:t xml:space="preserve">Busca un formato de Carta Gantt que te acomode y organiza en este las actividades planificadas en el punto anterior considerando el periodo asignado para el desarrollo de tu Proyecto APT. Debes mantener la temporalidad del periodo académico en el desarrollo de las tres fases que contempla la Asignatura de Portafolio de Título.</w:t>
+              <w:t xml:space="preserve">.</w:t>
             </w:r>
           </w:p>
         </w:tc>
@@ -6753,7 +6995,7 @@
       <w:pPr>
         <w:rPr/>
         <w:sectPr>
-          <w:headerReference r:id="rId9" w:type="default"/>
+          <w:headerReference r:id="rId8" w:type="default"/>
           <w:pgSz w:h="16838" w:w="11906" w:orient="portrait"/>
           <w:pgMar w:bottom="1417" w:top="1417" w:left="1701" w:right="1701" w:header="708" w:footer="708"/>
           <w:pgNumType w:start="1"/>
@@ -6874,7 +7116,7 @@
                 <w:color w:val="ffffff"/>
                 <w:rtl w:val="0"/>
               </w:rPr>
-              <w:t xml:space="preserve">Actividad</w:t>
+              <w:t xml:space="preserve">Activity</w:t>
             </w:r>
             <w:r>
               <w:rPr>
@@ -6925,7 +7167,7 @@
                 <w:szCs w:val="20"/>
                 <w:rtl w:val="0"/>
               </w:rPr>
-              <w:t xml:space="preserve">Responsable</w:t>
+              <w:t xml:space="preserve">Person In Charge</w:t>
             </w:r>
             <w:r>
               <w:rPr>
@@ -6963,7 +7205,7 @@
                 <w:color w:val="ffffff"/>
                 <w:rtl w:val="0"/>
               </w:rPr>
-              <w:t xml:space="preserve">Semana 04-08-2025</w:t>
+              <w:t xml:space="preserve">Week 04-08-2025</w:t>
             </w:r>
             <w:r>
               <w:rPr>
@@ -7001,7 +7243,7 @@
                 <w:color w:val="ffffff"/>
                 <w:rtl w:val="0"/>
               </w:rPr>
-              <w:t xml:space="preserve">Semana 11-08-2025</w:t>
+              <w:t xml:space="preserve">Week 11-08-2025</w:t>
             </w:r>
             <w:r>
               <w:rPr>
@@ -7039,7 +7281,7 @@
                 <w:color w:val="ffffff"/>
                 <w:rtl w:val="0"/>
               </w:rPr>
-              <w:t xml:space="preserve">Semana 18-08-2025</w:t>
+              <w:t xml:space="preserve">Week 18-08-2025</w:t>
             </w:r>
             <w:r>
               <w:rPr>
@@ -7077,7 +7319,7 @@
                 <w:color w:val="ffffff"/>
                 <w:rtl w:val="0"/>
               </w:rPr>
-              <w:t xml:space="preserve">Semana 25-08-2025</w:t>
+              <w:t xml:space="preserve">Week 25-08-2025</w:t>
             </w:r>
             <w:r>
               <w:rPr>
@@ -7115,7 +7357,7 @@
                 <w:color w:val="ffffff"/>
                 <w:rtl w:val="0"/>
               </w:rPr>
-              <w:t xml:space="preserve">Semana 01-09-2025</w:t>
+              <w:t xml:space="preserve">Week 01-09-2025</w:t>
             </w:r>
             <w:r>
               <w:rPr>
@@ -7153,7 +7395,7 @@
                 <w:color w:val="ffffff"/>
                 <w:rtl w:val="0"/>
               </w:rPr>
-              <w:t xml:space="preserve">Semana 08-09-2025</w:t>
+              <w:t xml:space="preserve">Week 08-09-2025</w:t>
             </w:r>
             <w:r>
               <w:rPr>
@@ -7191,7 +7433,7 @@
                 <w:color w:val="ffffff"/>
                 <w:rtl w:val="0"/>
               </w:rPr>
-              <w:t xml:space="preserve">Semana 15-09-2025</w:t>
+              <w:t xml:space="preserve">Week 15-09-2025</w:t>
             </w:r>
             <w:r>
               <w:rPr>
@@ -7229,7 +7471,7 @@
                 <w:color w:val="ffffff"/>
                 <w:rtl w:val="0"/>
               </w:rPr>
-              <w:t xml:space="preserve">Semana 22-09-2025</w:t>
+              <w:t xml:space="preserve">Week 22-09-2025</w:t>
             </w:r>
             <w:r>
               <w:rPr>
@@ -7267,7 +7509,7 @@
                 <w:color w:val="ffffff"/>
                 <w:rtl w:val="0"/>
               </w:rPr>
-              <w:t xml:space="preserve">Semana 29-09-2025</w:t>
+              <w:t xml:space="preserve">Week 29-09-2025</w:t>
             </w:r>
             <w:r>
               <w:rPr>
@@ -7305,7 +7547,7 @@
                 <w:color w:val="ffffff"/>
                 <w:rtl w:val="0"/>
               </w:rPr>
-              <w:t xml:space="preserve">Semana 06-10-2025</w:t>
+              <w:t xml:space="preserve">Week 06-10-2025</w:t>
             </w:r>
             <w:r>
               <w:rPr>
@@ -7343,7 +7585,7 @@
                 <w:color w:val="ffffff"/>
                 <w:rtl w:val="0"/>
               </w:rPr>
-              <w:t xml:space="preserve">Semana 13-10-2025</w:t>
+              <w:t xml:space="preserve">Week 13-10-2025</w:t>
             </w:r>
             <w:r>
               <w:rPr>
@@ -7381,7 +7623,7 @@
                 <w:color w:val="ffffff"/>
                 <w:rtl w:val="0"/>
               </w:rPr>
-              <w:t xml:space="preserve">Semana 20-10-2025</w:t>
+              <w:t xml:space="preserve">Week 20-10-2025</w:t>
             </w:r>
             <w:r>
               <w:rPr>
@@ -7419,7 +7661,7 @@
                 <w:color w:val="ffffff"/>
                 <w:rtl w:val="0"/>
               </w:rPr>
-              <w:t xml:space="preserve">Semana 27-10-2025</w:t>
+              <w:t xml:space="preserve">Week 27-10-2025</w:t>
             </w:r>
             <w:r>
               <w:rPr>
@@ -7457,7 +7699,7 @@
                 <w:color w:val="ffffff"/>
                 <w:rtl w:val="0"/>
               </w:rPr>
-              <w:t xml:space="preserve">Semana 03-11-2025</w:t>
+              <w:t xml:space="preserve">Week 03-11-2025</w:t>
             </w:r>
             <w:r>
               <w:rPr>
@@ -7495,7 +7737,7 @@
                 <w:color w:val="ffffff"/>
                 <w:rtl w:val="0"/>
               </w:rPr>
-              <w:t xml:space="preserve">Semana 10-11-2025</w:t>
+              <w:t xml:space="preserve">Week 10-11-2025</w:t>
             </w:r>
             <w:r>
               <w:rPr>
@@ -7533,7 +7775,7 @@
                 <w:color w:val="ffffff"/>
                 <w:rtl w:val="0"/>
               </w:rPr>
-              <w:t xml:space="preserve">Semana 17-11-2025</w:t>
+              <w:t xml:space="preserve">Week 17-11-2025</w:t>
             </w:r>
             <w:r>
               <w:rPr>
@@ -7571,7 +7813,7 @@
                 <w:color w:val="ffffff"/>
                 <w:rtl w:val="0"/>
               </w:rPr>
-              <w:t xml:space="preserve">Semana 24-11-2025</w:t>
+              <w:t xml:space="preserve">Week 24-11-2025</w:t>
             </w:r>
             <w:r>
               <w:rPr>
@@ -7609,7 +7851,7 @@
                 <w:color w:val="ffffff"/>
                 <w:rtl w:val="0"/>
               </w:rPr>
-              <w:t xml:space="preserve">Semana 01-12-2025</w:t>
+              <w:t xml:space="preserve">Week 01-12-2025</w:t>
             </w:r>
             <w:r>
               <w:rPr>
@@ -7653,7 +7895,7 @@
                 <w:color w:val="434343"/>
                 <w:rtl w:val="0"/>
               </w:rPr>
-              <w:t xml:space="preserve">Levantamiento de requerimientos</w:t>
+              <w:t xml:space="preserve">Requirements Gathering</w:t>
             </w:r>
             <w:r>
               <w:rPr>
@@ -8248,7 +8490,7 @@
                 <w:color w:val="434343"/>
                 <w:rtl w:val="0"/>
               </w:rPr>
-              <w:t xml:space="preserve">Análisis de factibilidad</w:t>
+              <w:t xml:space="preserve">Feasibility Analysis</w:t>
             </w:r>
             <w:r>
               <w:rPr>
@@ -8843,7 +9085,7 @@
                 <w:color w:val="434343"/>
                 <w:rtl w:val="0"/>
               </w:rPr>
-              <w:t xml:space="preserve">Diseño base de datos</w:t>
+              <w:t xml:space="preserve">Database Design</w:t>
             </w:r>
             <w:r>
               <w:rPr>
@@ -9448,7 +9690,7 @@
                 <w:color w:val="434343"/>
                 <w:rtl w:val="0"/>
               </w:rPr>
-              <w:t xml:space="preserve">Diseño de arquitectura</w:t>
+              <w:t xml:space="preserve">Architecture Design</w:t>
             </w:r>
             <w:r>
               <w:rPr>
@@ -10049,16 +10291,9 @@
             </w:pPr>
             <w:r>
               <w:rPr>
-                <w:rFonts w:ascii="Roboto" w:cs="Roboto" w:eastAsia="Roboto" w:hAnsi="Roboto"/>
-                <w:color w:val="434343"/>
-                <w:rtl w:val="0"/>
-              </w:rPr>
-              <w:t xml:space="preserve">Desarrollo backend (API REST .NET)</w:t>
-            </w:r>
-            <w:r>
-              <w:rPr>
-                <w:rtl w:val="0"/>
-              </w:rPr>
+                <w:rtl w:val="0"/>
+              </w:rPr>
+              <w:t xml:space="preserve">Backend Development (.NET REST API)</w:t>
             </w:r>
           </w:p>
         </w:tc>
@@ -11283,7 +11518,7 @@
                 <w:color w:val="434343"/>
                 <w:rtl w:val="0"/>
               </w:rPr>
-              <w:t xml:space="preserve">Integración frontend-backend</w:t>
+              <w:t xml:space="preserve">Frontend–Backend Integration</w:t>
             </w:r>
             <w:r>
               <w:rPr>
@@ -11888,7 +12123,7 @@
                 <w:color w:val="434343"/>
                 <w:rtl w:val="0"/>
               </w:rPr>
-              <w:t xml:space="preserve">Pruebas unitarias</w:t>
+              <w:t xml:space="preserve">Unit Testing</w:t>
             </w:r>
             <w:r>
               <w:rPr>
@@ -12489,16 +12724,9 @@
             </w:pPr>
             <w:r>
               <w:rPr>
-                <w:rFonts w:ascii="Roboto" w:cs="Roboto" w:eastAsia="Roboto" w:hAnsi="Roboto"/>
-                <w:color w:val="434343"/>
-                <w:rtl w:val="0"/>
-              </w:rPr>
-              <w:t xml:space="preserve">Pruebas de integración (E2E)</w:t>
-            </w:r>
-            <w:r>
-              <w:rPr>
-                <w:rtl w:val="0"/>
-              </w:rPr>
+                <w:rtl w:val="0"/>
+              </w:rPr>
+              <w:t xml:space="preserve">Integration Testing (E2E)</w:t>
             </w:r>
           </w:p>
         </w:tc>
@@ -13098,7 +13326,7 @@
                 <w:color w:val="434343"/>
                 <w:rtl w:val="0"/>
               </w:rPr>
-              <w:t xml:space="preserve">Ajustes y correcciones</w:t>
+              <w:t xml:space="preserve">Adjustments and Fixes</w:t>
             </w:r>
             <w:r>
               <w:rPr>
@@ -13699,16 +13927,9 @@
             </w:pPr>
             <w:r>
               <w:rPr>
-                <w:rFonts w:ascii="Roboto" w:cs="Roboto" w:eastAsia="Roboto" w:hAnsi="Roboto"/>
-                <w:color w:val="434343"/>
-                <w:rtl w:val="0"/>
-              </w:rPr>
-              <w:t xml:space="preserve">Pruebas finales + despliegue simulado</w:t>
-            </w:r>
-            <w:r>
-              <w:rPr>
-                <w:rtl w:val="0"/>
-              </w:rPr>
+                <w:rtl w:val="0"/>
+              </w:rPr>
+              <w:t xml:space="preserve">Final Testing + Simulated Deployment</w:t>
             </w:r>
           </w:p>
         </w:tc>
@@ -14308,7 +14529,7 @@
                 <w:color w:val="434343"/>
                 <w:rtl w:val="0"/>
               </w:rPr>
-              <w:t xml:space="preserve">Preparación presentación final</w:t>
+              <w:t xml:space="preserve">Final Presentation Preparation</w:t>
             </w:r>
             <w:r>
               <w:rPr>
@@ -14903,7 +15124,7 @@
                 <w:color w:val="434343"/>
                 <w:rtl w:val="0"/>
               </w:rPr>
-              <w:t xml:space="preserve">Entrega final + exposición</w:t>
+              <w:t xml:space="preserve">Final Delivery + Presentation</w:t>
             </w:r>
             <w:r>
               <w:rPr>
@@ -15498,7 +15719,7 @@
                 <w:color w:val="434343"/>
                 <w:rtl w:val="0"/>
               </w:rPr>
-              <w:t xml:space="preserve">Semanas buffer</w:t>
+              <w:t xml:space="preserve">Buffer Weeks</w:t>
             </w:r>
             <w:r>
               <w:rPr>
@@ -16087,86 +16308,6 @@
     </w:sectPr>
   </w:body>
 </w:document>
-</file>
-
-<file path=word/footnotes.xml><?xml version="1.0" encoding="utf-8"?>
-<w:footnotes xmlns:mc="http://schemas.openxmlformats.org/markup-compatibility/2006" xmlns:o="urn:schemas-microsoft-com:office:office" xmlns:r="http://schemas.openxmlformats.org/officeDocument/2006/relationships" xmlns:m="http://schemas.openxmlformats.org/officeDocument/2006/math" xmlns:v="urn:schemas-microsoft-com:vml" xmlns:wp="http://schemas.openxmlformats.org/drawingml/2006/wordprocessingDrawing" xmlns:w10="urn:schemas-microsoft-com:office:word" xmlns:w="http://schemas.openxmlformats.org/wordprocessingml/2006/main" xmlns:wne="http://schemas.microsoft.com/office/word/2006/wordml" xmlns:sl="http://schemas.openxmlformats.org/schemaLibrary/2006/main" xmlns:a="http://schemas.openxmlformats.org/drawingml/2006/main" xmlns:pic="http://schemas.openxmlformats.org/drawingml/2006/picture" xmlns:c="http://schemas.openxmlformats.org/drawingml/2006/chart" xmlns:lc="http://schemas.openxmlformats.org/drawingml/2006/lockedCanvas" xmlns:dgm="http://schemas.openxmlformats.org/drawingml/2006/diagram" xmlns:wps="http://schemas.microsoft.com/office/word/2010/wordprocessingShape" xmlns:wpg="http://schemas.microsoft.com/office/word/2010/wordprocessingGroup" xmlns:w14="http://schemas.microsoft.com/office/word/2010/wordml" xmlns:w15="http://schemas.microsoft.com/office/word/2012/wordml" xmlns:w16="http://schemas.microsoft.com/office/word/2018/wordml" xmlns:w16cex="http://schemas.microsoft.com/office/word/2018/wordml/cex" xmlns:w16cid="http://schemas.microsoft.com/office/word/2016/wordml/cid" xmlns="http://schemas.microsoft.com/office/tasks/2019/documenttasks" xmlns:cr="http://schemas.microsoft.com/office/comments/2020/reactions">
-  <w:footnote w:id="0">
-    <w:p>
-      <w:pPr>
-        <w:keepNext w:val="0"/>
-        <w:keepLines w:val="0"/>
-        <w:pageBreakBefore w:val="0"/>
-        <w:widowControl w:val="1"/>
-        <w:pBdr>
-          <w:top w:space="0" w:sz="0" w:val="nil"/>
-          <w:left w:space="0" w:sz="0" w:val="nil"/>
-          <w:bottom w:space="0" w:sz="0" w:val="nil"/>
-          <w:right w:space="0" w:sz="0" w:val="nil"/>
-          <w:between w:space="0" w:sz="0" w:val="nil"/>
-        </w:pBdr>
-        <w:shd w:fill="auto" w:val="clear"/>
-        <w:spacing w:after="0" w:before="0" w:line="240" w:lineRule="auto"/>
-        <w:ind w:left="0" w:right="0" w:firstLine="0"/>
-        <w:jc w:val="left"/>
-        <w:rPr>
-          <w:rFonts w:ascii="Calibri" w:cs="Calibri" w:eastAsia="Calibri" w:hAnsi="Calibri"/>
-          <w:b w:val="0"/>
-          <w:i w:val="0"/>
-          <w:smallCaps w:val="0"/>
-          <w:strike w:val="0"/>
-          <w:color w:val="595959"/>
-          <w:sz w:val="20"/>
-          <w:szCs w:val="20"/>
-          <w:u w:val="none"/>
-          <w:shd w:fill="auto" w:val="clear"/>
-          <w:vertAlign w:val="baseline"/>
-        </w:rPr>
-      </w:pPr>
-      <w:r>
-        <w:rPr>
-          <w:rStyle w:val="FootnoteReference"/>
-          <w:vertAlign w:val="superscript"/>
-        </w:rPr>
-        <w:footnoteRef/>
-      </w:r>
-      <w:r>
-        <w:rPr>
-          <w:rFonts w:ascii="Calibri" w:cs="Calibri" w:eastAsia="Calibri" w:hAnsi="Calibri"/>
-          <w:b w:val="0"/>
-          <w:i w:val="0"/>
-          <w:smallCaps w:val="0"/>
-          <w:strike w:val="0"/>
-          <w:color w:val="000000"/>
-          <w:sz w:val="20"/>
-          <w:szCs w:val="20"/>
-          <w:u w:val="none"/>
-          <w:shd w:fill="auto" w:val="clear"/>
-          <w:vertAlign w:val="baseline"/>
-          <w:rtl w:val="0"/>
-        </w:rPr>
-        <w:t xml:space="preserve"> </w:t>
-      </w:r>
-      <w:r>
-        <w:rPr>
-          <w:rFonts w:ascii="Calibri" w:cs="Calibri" w:eastAsia="Calibri" w:hAnsi="Calibri"/>
-          <w:b w:val="0"/>
-          <w:i w:val="0"/>
-          <w:smallCaps w:val="0"/>
-          <w:strike w:val="0"/>
-          <w:color w:val="595959"/>
-          <w:sz w:val="20"/>
-          <w:szCs w:val="20"/>
-          <w:u w:val="none"/>
-          <w:shd w:fill="auto" w:val="clear"/>
-          <w:vertAlign w:val="baseline"/>
-          <w:rtl w:val="0"/>
-        </w:rPr>
-        <w:t xml:space="preserve">En caso de que el Proyecto APT sea grupal, en esta columna deben indicar el nombre de los responsables de cada tarea o actividad. Esto posteriormente permitirá diferenciar la evaluación por cada integrante.</w:t>
-      </w:r>
-    </w:p>
-  </w:footnote>
-</w:footnotes>
 </file>
 
 <file path=word/header1.xml><?xml version="1.0" encoding="utf-8"?>
@@ -16270,7 +16411,7 @@
               <w:szCs w:val="24"/>
               <w:rtl w:val="0"/>
             </w:rPr>
-            <w:t xml:space="preserve">Guía Estudiante - Definición Proyecto APT </w:t>
+            <w:t xml:space="preserve">Student Guide - Project Definition APT </w:t>
           </w:r>
         </w:p>
         <w:p>
@@ -16293,7 +16434,7 @@
               <w:szCs w:val="24"/>
               <w:rtl w:val="0"/>
             </w:rPr>
-            <w:t xml:space="preserve">Fase 1</w:t>
+            <w:t xml:space="preserve">Phase 1</w:t>
           </w:r>
         </w:p>
       </w:tc>
@@ -16749,11 +16890,19 @@
       </w:pPr>
     </w:pPrDefault>
   </w:docDefaults>
+  <w:style w:type="table" w:styleId="TableNormal" w:default="1">
+    <w:name w:val="TableNormal"/>
+    <w:tblPr>
+      <w:tblCellMar>
+        <w:top w:w="100.0" w:type="dxa"/>
+        <w:left w:w="100.0" w:type="dxa"/>
+        <w:bottom w:w="100.0" w:type="dxa"/>
+        <w:right w:w="100.0" w:type="dxa"/>
+      </w:tblCellMar>
+    </w:tblPr>
+  </w:style>
   <w:style w:type="paragraph" w:styleId="Normal" w:default="1">
     <w:name w:val="normal"/>
-  </w:style>
-  <w:style w:type="table" w:styleId="TableNormal" w:default="1">
-    <w:name w:val="TableNormal"/>
   </w:style>
   <w:style w:type="paragraph" w:styleId="Heading1">
     <w:name w:val="heading 1"/>
@@ -17433,12 +17582,7 @@
     <w:tblPr>
       <w:tblStyleRowBandSize w:val="1"/>
       <w:tblStyleColBandSize w:val="1"/>
-      <w:tblCellMar>
-        <w:top w:w="100.0" w:type="dxa"/>
-        <w:left w:w="100.0" w:type="dxa"/>
-        <w:bottom w:w="100.0" w:type="dxa"/>
-        <w:right w:w="100.0" w:type="dxa"/>
-      </w:tblCellMar>
+      <w:tblCellMar/>
     </w:tblPr>
   </w:style>
   <w:style w:type="table" w:styleId="Table17">

</xml_diff>

<commit_message>
modificacion definicion proyecto ingles
</commit_message>
<xml_diff>
--- a/Fase 1/Evidencias Grupales/1.5_GuiaEstudiante_Fase 1_Definicion Proyecto APT (Inglés).docx
+++ b/Fase 1/Evidencias Grupales/1.5_GuiaEstudiante_Fase 1_Definicion Proyecto APT (Inglés).docx
@@ -766,7 +766,7 @@
                 <w:b w:val="1"/>
                 <w:rtl w:val="0"/>
               </w:rPr>
-              <w:t xml:space="preserve">Ingenieria en Informatica</w:t>
+              <w:t xml:space="preserve">Computer Engineering</w:t>
             </w:r>
           </w:p>
         </w:tc>
@@ -2960,7 +2960,7 @@
                 <w:color w:val="1f3864"/>
                 <w:rtl w:val="0"/>
               </w:rPr>
-              <w:t xml:space="preserve">Descripción de la Metodología</w:t>
+              <w:t xml:space="preserve">Description of the Methodology</w:t>
             </w:r>
             <w:r>
               <w:rPr>
@@ -10903,7 +10903,7 @@
                 <w:color w:val="434343"/>
                 <w:rtl w:val="0"/>
               </w:rPr>
-              <w:t xml:space="preserve">Desarrollo frontend (UI prototipo)</w:t>
+              <w:t xml:space="preserve">Frontend Development (UI Prototype)</w:t>
             </w:r>
             <w:r>
               <w:rPr>
@@ -13359,11 +13359,16 @@
             </w:pPr>
             <w:r>
               <w:rPr>
-                <w:rFonts w:ascii="Roboto" w:cs="Roboto" w:eastAsia="Roboto" w:hAnsi="Roboto"/>
-                <w:color w:val="434343"/>
-                <w:rtl w:val="0"/>
-              </w:rPr>
-              <w:t xml:space="preserve">Ambos</w:t>
+                <w:b w:val="1"/>
+                <w:rtl w:val="0"/>
+              </w:rPr>
+              <w:t xml:space="preserve">Both</w:t>
+            </w:r>
+            <w:r>
+              <w:rPr>
+                <w:rtl w:val="0"/>
+              </w:rPr>
+              <w:t xml:space="preserve"> </w:t>
             </w:r>
             <w:r>
               <w:rPr>
@@ -13957,11 +13962,16 @@
             </w:pPr>
             <w:r>
               <w:rPr>
-                <w:rFonts w:ascii="Roboto" w:cs="Roboto" w:eastAsia="Roboto" w:hAnsi="Roboto"/>
-                <w:color w:val="434343"/>
-                <w:rtl w:val="0"/>
-              </w:rPr>
-              <w:t xml:space="preserve">Ambos</w:t>
+                <w:b w:val="1"/>
+                <w:rtl w:val="0"/>
+              </w:rPr>
+              <w:t xml:space="preserve">Both</w:t>
+            </w:r>
+            <w:r>
+              <w:rPr>
+                <w:rtl w:val="0"/>
+              </w:rPr>
+              <w:t xml:space="preserve"> </w:t>
             </w:r>
             <w:r>
               <w:rPr>
@@ -14562,11 +14572,16 @@
             </w:pPr>
             <w:r>
               <w:rPr>
-                <w:rFonts w:ascii="Roboto" w:cs="Roboto" w:eastAsia="Roboto" w:hAnsi="Roboto"/>
-                <w:color w:val="434343"/>
-                <w:rtl w:val="0"/>
-              </w:rPr>
-              <w:t xml:space="preserve">Ambos</w:t>
+                <w:b w:val="1"/>
+                <w:rtl w:val="0"/>
+              </w:rPr>
+              <w:t xml:space="preserve">Both</w:t>
+            </w:r>
+            <w:r>
+              <w:rPr>
+                <w:rtl w:val="0"/>
+              </w:rPr>
+              <w:t xml:space="preserve"> </w:t>
             </w:r>
             <w:r>
               <w:rPr>
@@ -15157,11 +15172,16 @@
             </w:pPr>
             <w:r>
               <w:rPr>
-                <w:rFonts w:ascii="Roboto" w:cs="Roboto" w:eastAsia="Roboto" w:hAnsi="Roboto"/>
-                <w:color w:val="434343"/>
-                <w:rtl w:val="0"/>
-              </w:rPr>
-              <w:t xml:space="preserve">Ambos</w:t>
+                <w:b w:val="1"/>
+                <w:rtl w:val="0"/>
+              </w:rPr>
+              <w:t xml:space="preserve">Both</w:t>
+            </w:r>
+            <w:r>
+              <w:rPr>
+                <w:rtl w:val="0"/>
+              </w:rPr>
+              <w:t xml:space="preserve"> </w:t>
             </w:r>
             <w:r>
               <w:rPr>
@@ -15752,11 +15772,16 @@
             </w:pPr>
             <w:r>
               <w:rPr>
-                <w:rFonts w:ascii="Roboto" w:cs="Roboto" w:eastAsia="Roboto" w:hAnsi="Roboto"/>
-                <w:color w:val="434343"/>
-                <w:rtl w:val="0"/>
-              </w:rPr>
-              <w:t xml:space="preserve">Ambos</w:t>
+                <w:b w:val="1"/>
+                <w:rtl w:val="0"/>
+              </w:rPr>
+              <w:t xml:space="preserve">Both</w:t>
+            </w:r>
+            <w:r>
+              <w:rPr>
+                <w:rtl w:val="0"/>
+              </w:rPr>
+              <w:t xml:space="preserve"> </w:t>
             </w:r>
             <w:r>
               <w:rPr>

</xml_diff>